<commit_message>
feat: internalize refreshed TDS templates
</commit_message>
<xml_diff>
--- a/TDS Skill/templates/active/TDS_CN_冠志模板.docx
+++ b/TDS Skill/templates/active/TDS_CN_冠志模板.docx
@@ -452,35 +452,18 @@
         <w:pStyle w:val="Normal"/>
         <w:spacing w:lineRule="atLeast" w:line="0"/>
         <w:rPr>
-          <w:rFonts w:ascii="宋体" w:hAnsi="宋体" w:cs="宋体"/>
+          <w:rFonts w:ascii="宋体" w:hAnsi="宋体" w:eastAsia="宋体" w:cs="Times New Roman"/>
           <w:b/>
           <w:sz w:val="28"/>
         </w:rPr>
       </w:pPr>
       <w:r>
         <w:rPr>
-          <w:rFonts w:ascii="宋体" w:hAnsi="宋体" w:cs="宋体"/>
+          <w:rFonts w:ascii="宋体" w:hAnsi="宋体" w:cs="Times New Roman"/>
           <w:b/>
           <w:sz w:val="28"/>
         </w:rPr>
-        <w:t>【</w:t>
-      </w:r>
-      <w:r>
-        <w:rPr>
-          <w:rStyle w:val="HTML"/>
-          <w:rFonts w:ascii="宋体" w:hAnsi="宋体" w:cs="宋体"/>
-          <w:sz w:val="24"/>
-          <w:szCs w:val="24"/>
-        </w:rPr>
-        <w:t>供应形式</w:t>
-      </w:r>
-      <w:r>
-        <w:rPr>
-          <w:rFonts w:ascii="宋体" w:hAnsi="宋体" w:cs="宋体"/>
-          <w:b/>
-          <w:sz w:val="28"/>
-        </w:rPr>
-        <w:t>】</w:t>
+        <w:t>【供应形式】</w:t>
       </w:r>
     </w:p>
     <w:p>
@@ -496,7 +479,7 @@
       </w:pPr>
       <w:r>
         <w:rPr>
-          <w:rFonts w:cs="宋体" w:ascii="宋体" w:hAnsi="宋体"/>
+          <w:rFonts w:eastAsia="宋体" w:cs="宋体" w:ascii="宋体" w:hAnsi="宋体"/>
           <w:b/>
           <w:sz w:val="13"/>
           <w:szCs w:val="6"/>

</xml_diff>

<commit_message>
fix: lock TDS feature numbering and spacing
</commit_message>
<xml_diff>
--- a/TDS Skill/templates/active/TDS_CN_冠志模板.docx
+++ b/TDS Skill/templates/active/TDS_CN_冠志模板.docx
@@ -1620,16 +1620,12 @@
     <w:p>
       <w:pPr>
         <w:pStyle w:val="Normal"/>
-        <w:numPr>
-          <w:ilvl w:val="0"/>
-          <w:numId w:val="1"/>
-        </w:numPr>
         <w:tabs>
           <w:tab w:val="clear" w:pos="720"/>
           <w:tab w:val="left" w:pos="840" w:leader="none"/>
         </w:tabs>
         <w:spacing w:lineRule="atLeast" w:line="0"/>
-        <w:ind w:hanging="366" w:start="840" w:end="0"/>
+        <w:ind w:firstLineChars="0" w:firstLine="0" w:startChars="0" w:start="0" w:endChars="0" w:end="0"/>
         <w:jc w:val="both"/>
         <w:rPr>
           <w:rFonts w:ascii="Times New Roman" w:hAnsi="Times New Roman" w:eastAsia="Times New Roman" w:cs="Times New Roman"/>
@@ -1663,16 +1659,12 @@
     <w:p>
       <w:pPr>
         <w:pStyle w:val="Normal"/>
-        <w:numPr>
-          <w:ilvl w:val="0"/>
-          <w:numId w:val="1"/>
-        </w:numPr>
         <w:tabs>
           <w:tab w:val="clear" w:pos="720"/>
           <w:tab w:val="left" w:pos="840" w:leader="none"/>
         </w:tabs>
         <w:spacing w:lineRule="atLeast" w:line="0"/>
-        <w:ind w:hanging="366" w:start="840" w:end="0"/>
+        <w:ind w:firstLineChars="0" w:firstLine="0" w:startChars="0" w:start="0" w:endChars="0" w:end="0"/>
         <w:jc w:val="both"/>
         <w:rPr>
           <w:rFonts w:ascii="Times New Roman" w:hAnsi="Times New Roman" w:eastAsia="Times New Roman" w:cs="Times New Roman"/>
@@ -2037,6 +2029,7 @@
     <w:lvl w:ilvl="0">
       <w:start w:val="1"/>
       <w:numFmt w:val="decimal"/>
+      <w:suff w:val="space"/>
       <w:lvlText w:val="%1."/>
       <w:lvlJc w:val="start"/>
       <w:pPr>
@@ -2046,10 +2039,13 @@
         <w:ind w:start="0" w:hanging="0"/>
       </w:pPr>
     </w:lvl>
-    <w:lvl w:ilvl="1">
-      <w:start w:val="1"/>
-      <w:numFmt w:val="bullet"/>
-      <w:lvlText w:val=""/>
+  </w:abstractNum>
+  <w:abstractNum w:abstractNumId="2">
+    <w:lvl w:ilvl="0">
+      <w:start w:val="2"/>
+      <w:numFmt w:val="decimal"/>
+      <w:suff w:val="space"/>
+      <w:lvlText w:val="%1."/>
       <w:lvlJc w:val="start"/>
       <w:pPr>
         <w:tabs>
@@ -2057,117 +2053,9 @@
         </w:tabs>
         <w:ind w:start="0" w:hanging="0"/>
       </w:pPr>
-      <w:rPr>
-        <w:rFonts w:ascii="Symbol" w:hAnsi="Symbol" w:cs="Symbol" w:hint="default"/>
-      </w:rPr>
-    </w:lvl>
-    <w:lvl w:ilvl="2">
-      <w:start w:val="1"/>
-      <w:numFmt w:val="bullet"/>
-      <w:lvlText w:val=""/>
-      <w:lvlJc w:val="start"/>
-      <w:pPr>
-        <w:tabs>
-          <w:tab w:val="num" w:pos="0"/>
-        </w:tabs>
-        <w:ind w:start="0" w:hanging="0"/>
-      </w:pPr>
-      <w:rPr>
-        <w:rFonts w:ascii="Symbol" w:hAnsi="Symbol" w:cs="Symbol" w:hint="default"/>
-      </w:rPr>
-    </w:lvl>
-    <w:lvl w:ilvl="3">
-      <w:start w:val="1"/>
-      <w:numFmt w:val="bullet"/>
-      <w:lvlText w:val=""/>
-      <w:lvlJc w:val="start"/>
-      <w:pPr>
-        <w:tabs>
-          <w:tab w:val="num" w:pos="0"/>
-        </w:tabs>
-        <w:ind w:start="0" w:hanging="0"/>
-      </w:pPr>
-      <w:rPr>
-        <w:rFonts w:ascii="Symbol" w:hAnsi="Symbol" w:cs="Symbol" w:hint="default"/>
-      </w:rPr>
-    </w:lvl>
-    <w:lvl w:ilvl="4">
-      <w:start w:val="1"/>
-      <w:numFmt w:val="bullet"/>
-      <w:lvlText w:val=""/>
-      <w:lvlJc w:val="start"/>
-      <w:pPr>
-        <w:tabs>
-          <w:tab w:val="num" w:pos="0"/>
-        </w:tabs>
-        <w:ind w:start="0" w:hanging="0"/>
-      </w:pPr>
-      <w:rPr>
-        <w:rFonts w:ascii="Symbol" w:hAnsi="Symbol" w:cs="Symbol" w:hint="default"/>
-      </w:rPr>
-    </w:lvl>
-    <w:lvl w:ilvl="5">
-      <w:start w:val="1"/>
-      <w:numFmt w:val="bullet"/>
-      <w:lvlText w:val=""/>
-      <w:lvlJc w:val="start"/>
-      <w:pPr>
-        <w:tabs>
-          <w:tab w:val="num" w:pos="0"/>
-        </w:tabs>
-        <w:ind w:start="0" w:hanging="0"/>
-      </w:pPr>
-      <w:rPr>
-        <w:rFonts w:ascii="Symbol" w:hAnsi="Symbol" w:cs="Symbol" w:hint="default"/>
-      </w:rPr>
-    </w:lvl>
-    <w:lvl w:ilvl="6">
-      <w:start w:val="1"/>
-      <w:numFmt w:val="bullet"/>
-      <w:lvlText w:val=""/>
-      <w:lvlJc w:val="start"/>
-      <w:pPr>
-        <w:tabs>
-          <w:tab w:val="num" w:pos="0"/>
-        </w:tabs>
-        <w:ind w:start="0" w:hanging="0"/>
-      </w:pPr>
-      <w:rPr>
-        <w:rFonts w:ascii="Symbol" w:hAnsi="Symbol" w:cs="Symbol" w:hint="default"/>
-      </w:rPr>
-    </w:lvl>
-    <w:lvl w:ilvl="7">
-      <w:start w:val="1"/>
-      <w:numFmt w:val="bullet"/>
-      <w:lvlText w:val=""/>
-      <w:lvlJc w:val="start"/>
-      <w:pPr>
-        <w:tabs>
-          <w:tab w:val="num" w:pos="0"/>
-        </w:tabs>
-        <w:ind w:start="0" w:hanging="0"/>
-      </w:pPr>
-      <w:rPr>
-        <w:rFonts w:ascii="Symbol" w:hAnsi="Symbol" w:cs="Symbol" w:hint="default"/>
-      </w:rPr>
-    </w:lvl>
-    <w:lvl w:ilvl="8">
-      <w:start w:val="1"/>
-      <w:numFmt w:val="bullet"/>
-      <w:lvlText w:val=""/>
-      <w:lvlJc w:val="start"/>
-      <w:pPr>
-        <w:tabs>
-          <w:tab w:val="num" w:pos="0"/>
-        </w:tabs>
-        <w:ind w:start="0" w:hanging="0"/>
-      </w:pPr>
-      <w:rPr>
-        <w:rFonts w:ascii="Symbol" w:hAnsi="Symbol" w:cs="Symbol" w:hint="default"/>
-      </w:rPr>
     </w:lvl>
   </w:abstractNum>
-  <w:abstractNum w:abstractNumId="2">
+  <w:abstractNum w:abstractNumId="3">
     <w:lvl w:ilvl="0">
       <w:start w:val="1"/>
       <w:numFmt w:val="none"/>
@@ -2291,6 +2179,9 @@
   </w:num>
   <w:num w:numId="2">
     <w:abstractNumId w:val="2"/>
+  </w:num>
+  <w:num w:numId="3">
+    <w:abstractNumId w:val="3"/>
   </w:num>
 </w:numbering>
 </file>
@@ -2488,6 +2379,9 @@
   <w:style w:type="numbering" w:styleId="WW8Num1">
     <w:name w:val="WW8Num1"/>
   </w:style>
+  <w:style w:type="numbering" w:styleId="WW8Num2">
+    <w:name w:val="WW8Num2"/>
+  </w:style>
 </w:styles>
 </file>
 

</xml_diff>

<commit_message>
release: TDS Skill v1.3.5 feature formatting fix
</commit_message>
<xml_diff>
--- a/TDS Skill/templates/active/TDS_CN_冠志模板.docx
+++ b/TDS Skill/templates/active/TDS_CN_冠志模板.docx
@@ -1600,26 +1600,10 @@
     <w:p>
       <w:pPr>
         <w:pStyle w:val="Normal"/>
-        <w:spacing w:lineRule="atLeast" w:line="0"/>
-        <w:rPr>
-          <w:rFonts w:ascii="宋体" w:hAnsi="宋体" w:cs="宋体"/>
-          <w:b/>
-          <w:sz w:val="13"/>
-          <w:szCs w:val="6"/>
-        </w:rPr>
-      </w:pPr>
-      <w:r>
-        <w:rPr>
-          <w:rFonts w:cs="宋体" w:ascii="宋体" w:hAnsi="宋体"/>
-          <w:b/>
-          <w:sz w:val="13"/>
-          <w:szCs w:val="6"/>
-        </w:rPr>
-      </w:r>
-    </w:p>
-    <w:p>
-      <w:pPr>
-        <w:pStyle w:val="Normal"/>
+        <w:numPr>
+          <w:ilvl w:val="0"/>
+          <w:numId w:val="0"/>
+        </w:numPr>
         <w:tabs>
           <w:tab w:val="clear" w:pos="720"/>
           <w:tab w:val="left" w:pos="840" w:leader="none"/>
@@ -1628,37 +1612,27 @@
         <w:ind w:firstLineChars="0" w:firstLine="0" w:startChars="0" w:start="0" w:endChars="0" w:end="0"/>
         <w:jc w:val="both"/>
         <w:rPr>
-          <w:rFonts w:ascii="Times New Roman" w:hAnsi="Times New Roman" w:eastAsia="Times New Roman" w:cs="Times New Roman"/>
-          <w:sz w:val="24"/>
-        </w:rPr>
-      </w:pPr>
-      <w:r>
-        <w:rPr>
-          <w:rFonts w:ascii="宋体" w:hAnsi="宋体" w:cs="Times New Roman" w:hint="eastAsia"/>
-          <w:sz w:val="24"/>
-        </w:rPr>
-        <w:t>自乳化固体环氧，储存稳定性佳，储存过程粘度稳定；</w:t>
-      </w:r>
-    </w:p>
-    <w:p>
-      <w:pPr>
-        <w:pStyle w:val="Normal"/>
-        <w:spacing w:lineRule="exact" w:line="98"/>
-        <w:rPr>
-          <w:rFonts w:ascii="Times New Roman" w:hAnsi="Times New Roman" w:eastAsia="Times New Roman" w:cs="Times New Roman"/>
-          <w:sz w:val="24"/>
-        </w:rPr>
-      </w:pPr>
-      <w:r>
-        <w:rPr>
-          <w:rFonts w:eastAsia="Times New Roman" w:cs="Times New Roman"/>
-          <w:sz w:val="24"/>
-        </w:rPr>
-      </w:r>
-    </w:p>
-    <w:p>
-      <w:pPr>
-        <w:pStyle w:val="Normal"/>
+          <w:rFonts w:ascii="宋体" w:hAnsi="宋体" w:eastAsia="宋体" w:cs="Times New Roman" w:hint="eastAsia"/>
+          <w:sz w:val="11"/>
+          <w:szCs w:val="6"/>
+        </w:rPr>
+      </w:pPr>
+      <w:r>
+        <w:rPr>
+          <w:rFonts w:eastAsia="宋体" w:cs="Times New Roman" w:hint="eastAsia" w:ascii="宋体" w:hAnsi="宋体"/>
+          <w:b/>
+          <w:sz w:val="11"/>
+          <w:szCs w:val="6"/>
+        </w:rPr>
+      </w:r>
+    </w:p>
+    <w:p>
+      <w:pPr>
+        <w:pStyle w:val="Normal"/>
+        <w:numPr>
+          <w:ilvl w:val="0"/>
+          <w:numId w:val="1"/>
+        </w:numPr>
         <w:tabs>
           <w:tab w:val="clear" w:pos="720"/>
           <w:tab w:val="left" w:pos="840" w:leader="none"/>
@@ -1667,7 +1641,7 @@
         <w:ind w:firstLineChars="0" w:firstLine="0" w:startChars="0" w:start="0" w:endChars="0" w:end="0"/>
         <w:jc w:val="both"/>
         <w:rPr>
-          <w:rFonts w:ascii="Times New Roman" w:hAnsi="Times New Roman" w:eastAsia="Times New Roman" w:cs="Times New Roman"/>
+          <w:rFonts w:ascii="宋体" w:hAnsi="宋体" w:eastAsia="宋体" w:cs="Times New Roman" w:hint="eastAsia"/>
           <w:sz w:val="24"/>
         </w:rPr>
       </w:pPr>
@@ -1676,24 +1650,61 @@
           <w:rFonts w:ascii="宋体" w:hAnsi="宋体" w:cs="Times New Roman" w:hint="eastAsia"/>
           <w:sz w:val="24"/>
         </w:rPr>
-        <w:t>对配方设计的容忍度高，可直接用于色浆研磨。</w:t>
-      </w:r>
-    </w:p>
-    <w:p>
-      <w:pPr>
-        <w:pStyle w:val="Normal"/>
-        <w:spacing w:lineRule="exact" w:line="207"/>
-        <w:rPr>
-          <w:rFonts w:ascii="Times New Roman" w:hAnsi="Times New Roman" w:eastAsia="Times New Roman" w:cs="Times New Roman"/>
-          <w:sz w:val="11"/>
-          <w:szCs w:val="6"/>
-        </w:rPr>
-      </w:pPr>
-      <w:r>
-        <w:rPr>
-          <w:rFonts w:eastAsia="Times New Roman" w:cs="Times New Roman"/>
-          <w:sz w:val="11"/>
-          <w:szCs w:val="6"/>
+        <w:t>自乳化固体环氧，储存稳定性佳，储存过程粘度稳定；</w:t>
+      </w:r>
+    </w:p>
+    <w:p>
+      <w:pPr>
+        <w:pStyle w:val="Normal"/>
+        <w:numPr>
+          <w:ilvl w:val="0"/>
+          <w:numId w:val="1"/>
+        </w:numPr>
+        <w:tabs>
+          <w:tab w:val="clear" w:pos="720"/>
+          <w:tab w:val="left" w:pos="840" w:leader="none"/>
+        </w:tabs>
+        <w:spacing w:lineRule="atLeast" w:line="0"/>
+        <w:ind w:firstLineChars="0" w:firstLine="0" w:startChars="0" w:start="0" w:endChars="0" w:end="0"/>
+        <w:jc w:val="both"/>
+        <w:rPr>
+          <w:rFonts w:ascii="宋体" w:hAnsi="宋体" w:eastAsia="宋体" w:cs="Times New Roman" w:hint="eastAsia"/>
+          <w:sz w:val="24"/>
+        </w:rPr>
+      </w:pPr>
+      <w:r>
+        <w:rPr>
+          <w:rFonts w:ascii="宋体" w:hAnsi="宋体" w:cs="Times New Roman" w:hint="eastAsia"/>
+          <w:sz w:val="24"/>
+        </w:rPr>
+        <w:t>对配方设计的容忍度高，可直接用于色浆研磨；</w:t>
+      </w:r>
+    </w:p>
+    <w:p>
+      <w:pPr>
+        <w:pStyle w:val="Normal"/>
+        <w:numPr>
+          <w:ilvl w:val="0"/>
+          <w:numId w:val="0"/>
+        </w:numPr>
+        <w:tabs>
+          <w:tab w:val="clear" w:pos="720"/>
+          <w:tab w:val="left" w:pos="840" w:leader="none"/>
+        </w:tabs>
+        <w:spacing w:lineRule="atLeast" w:line="0"/>
+        <w:ind w:hanging="0" w:start="0"/>
+        <w:jc w:val="both"/>
+        <w:rPr>
+          <w:rFonts w:ascii="宋体" w:hAnsi="宋体" w:cs="宋体"/>
+          <w:b/>
+          <w:sz w:val="28"/>
+        </w:rPr>
+      </w:pPr>
+      <w:r>
+        <w:rPr>
+          <w:rFonts w:eastAsia="宋体" w:cs="宋体" w:hint="eastAsia" w:ascii="宋体" w:hAnsi="宋体"/>
+          <w:b/>
+          <w:sz w:val="28"/>
         </w:rPr>
       </w:r>
     </w:p>
@@ -1989,23 +2000,6 @@
       <w:r>
         <w:rPr>
           <w:rFonts w:eastAsia="宋体" w:cs="宋体" w:ascii="宋体" w:hAnsi="宋体"/>
-          <w:sz w:val="24"/>
-        </w:rPr>
-      </w:r>
-    </w:p>
-    <w:p>
-      <w:pPr>
-        <w:pStyle w:val="Normal"/>
-        <w:spacing w:lineRule="atLeast" w:line="0"/>
-        <w:ind w:start="480" w:end="0"/>
-        <w:rPr>
-          <w:rFonts w:ascii="宋体" w:hAnsi="宋体" w:cs="宋体"/>
-          <w:sz w:val="24"/>
-        </w:rPr>
-      </w:pPr>
-      <w:r>
-        <w:rPr>
-          <w:rFonts w:cs="宋体" w:ascii="宋体" w:hAnsi="宋体"/>
           <w:sz w:val="24"/>
         </w:rPr>
       </w:r>
@@ -2029,7 +2023,6 @@
     <w:lvl w:ilvl="0">
       <w:start w:val="1"/>
       <w:numFmt w:val="decimal"/>
-      <w:suff w:val="space"/>
       <w:lvlText w:val="%1."/>
       <w:lvlJc w:val="start"/>
       <w:pPr>
@@ -2041,21 +2034,6 @@
     </w:lvl>
   </w:abstractNum>
   <w:abstractNum w:abstractNumId="2">
-    <w:lvl w:ilvl="0">
-      <w:start w:val="2"/>
-      <w:numFmt w:val="decimal"/>
-      <w:suff w:val="space"/>
-      <w:lvlText w:val="%1."/>
-      <w:lvlJc w:val="start"/>
-      <w:pPr>
-        <w:tabs>
-          <w:tab w:val="num" w:pos="0"/>
-        </w:tabs>
-        <w:ind w:start="0" w:hanging="0"/>
-      </w:pPr>
-    </w:lvl>
-  </w:abstractNum>
-  <w:abstractNum w:abstractNumId="3">
     <w:lvl w:ilvl="0">
       <w:start w:val="1"/>
       <w:numFmt w:val="none"/>
@@ -2179,9 +2157,6 @@
   </w:num>
   <w:num w:numId="2">
     <w:abstractNumId w:val="2"/>
-  </w:num>
-  <w:num w:numId="3">
-    <w:abstractNumId w:val="3"/>
   </w:num>
 </w:numbering>
 </file>
@@ -2379,9 +2354,6 @@
   <w:style w:type="numbering" w:styleId="WW8Num1">
     <w:name w:val="WW8Num1"/>
   </w:style>
-  <w:style w:type="numbering" w:styleId="WW8Num2">
-    <w:name w:val="WW8Num2"/>
-  </w:style>
 </w:styles>
 </file>
 

</xml_diff>

<commit_message>
release TDS Skill v1.3.15: align feature number indent, remove wide tab gap, and support dynamic multi-feature cloning
</commit_message>
<xml_diff>
--- a/TDS Skill/templates/active/TDS_CN_冠志模板.docx
+++ b/TDS Skill/templates/active/TDS_CN_冠志模板.docx
@@ -1633,17 +1633,16 @@
           <w:ilvl w:val="0"/>
           <w:numId w:val="1"/>
         </w:numPr>
+        <w:spacing w:lineRule="atLeast" w:line="0"/>
+        <w:ind w:left="840" w:hanging="360"/>
+        <w:jc w:val="both"/>
+        <w:rPr>
+          <w:rFonts w:ascii="宋体" w:hAnsi="宋体" w:eastAsia="宋体" w:cs="Times New Roman" w:hint="eastAsia"/>
+          <w:sz w:val="24"/>
+        </w:rPr>
         <w:tabs>
-          <w:tab w:val="clear" w:pos="720"/>
-          <w:tab w:val="left" w:pos="840" w:leader="none"/>
+          <w:tab w:val="left" w:pos="840"/>
         </w:tabs>
-        <w:spacing w:lineRule="atLeast" w:line="0"/>
-        <w:ind w:firstLineChars="0" w:firstLine="0" w:startChars="0" w:start="0" w:endChars="0" w:end="0"/>
-        <w:jc w:val="both"/>
-        <w:rPr>
-          <w:rFonts w:ascii="宋体" w:hAnsi="宋体" w:eastAsia="宋体" w:cs="Times New Roman" w:hint="eastAsia"/>
-          <w:sz w:val="24"/>
-        </w:rPr>
       </w:pPr>
       <w:r>
         <w:rPr>
@@ -1660,17 +1659,16 @@
           <w:ilvl w:val="0"/>
           <w:numId w:val="1"/>
         </w:numPr>
+        <w:spacing w:lineRule="atLeast" w:line="0"/>
+        <w:ind w:left="840" w:hanging="360"/>
+        <w:jc w:val="both"/>
+        <w:rPr>
+          <w:rFonts w:ascii="宋体" w:hAnsi="宋体" w:eastAsia="宋体" w:cs="Times New Roman" w:hint="eastAsia"/>
+          <w:sz w:val="24"/>
+        </w:rPr>
         <w:tabs>
-          <w:tab w:val="clear" w:pos="720"/>
-          <w:tab w:val="left" w:pos="840" w:leader="none"/>
+          <w:tab w:val="left" w:pos="840"/>
         </w:tabs>
-        <w:spacing w:lineRule="atLeast" w:line="0"/>
-        <w:ind w:firstLineChars="0" w:firstLine="0" w:startChars="0" w:start="0" w:endChars="0" w:end="0"/>
-        <w:jc w:val="both"/>
-        <w:rPr>
-          <w:rFonts w:ascii="宋体" w:hAnsi="宋体" w:eastAsia="宋体" w:cs="Times New Roman" w:hint="eastAsia"/>
-          <w:sz w:val="24"/>
-        </w:rPr>
       </w:pPr>
       <w:r>
         <w:rPr>

</xml_diff>

<commit_message>
feat(tds): enforce Chinese source fidelity
</commit_message>
<xml_diff>
--- a/TDS Skill/templates/active/TDS_CN_冠志模板.docx
+++ b/TDS Skill/templates/active/TDS_CN_冠志模板.docx
@@ -292,7 +292,8 @@
     <w:p>
       <w:pPr>
         <w:spacing w:line="0" w:lineRule="atLeast"/>
-        <w:ind w:left="3020" w:right="0"/>
+        <w:jc w:val="center"/>
+        <w:ind w:right="0"/>
         <w:rPr>
           <w:rFonts w:hint="eastAsia" w:ascii="Times New Roman" w:hAnsi="Times New Roman" w:cs="Times New Roman"/>
           <w:b/>
@@ -319,7 +320,7 @@
     </w:p>
     <w:p>
       <w:pPr>
-        <w:spacing w:line="0" w:lineRule="atLeast"/>
+        <w:spacing w:line="0" w:lineRule="atLeast" w:before="100" w:after="80"/>
         <w:rPr>
           <w:rFonts w:ascii="宋体" w:hAnsi="宋体" w:cs="宋体"/>
           <w:b/>
@@ -348,7 +349,7 @@
     </w:p>
     <w:p>
       <w:pPr>
-        <w:spacing w:line="324" w:lineRule="auto"/>
+        <w:spacing w:line="300" w:lineRule="auto" w:before="0" w:after="60"/>
         <w:ind w:left="0" w:leftChars="0" w:right="0" w:rightChars="0" w:firstLineChars="200"/>
         <w:rPr>
           <w:rFonts w:hint="eastAsia" w:ascii="宋体" w:hAnsi="宋体" w:cs="宋体"/>
@@ -366,7 +367,7 @@
     </w:p>
     <w:p>
       <w:pPr>
-        <w:spacing w:line="0" w:lineRule="atLeast"/>
+        <w:spacing w:line="0" w:lineRule="atLeast" w:before="160" w:after="80"/>
         <w:rPr>
           <w:rFonts w:ascii="宋体" w:hAnsi="宋体" w:eastAsia="宋体" w:cs="Times New Roman"/>
           <w:b/>
@@ -395,7 +396,7 @@
     </w:p>
     <w:p>
       <w:pPr>
-        <w:spacing w:line="324" w:lineRule="auto"/>
+        <w:spacing w:line="300" w:lineRule="auto" w:before="0" w:after="60"/>
         <w:ind w:left="0" w:leftChars="0" w:right="0" w:rightChars="0" w:firstLineChars="200"/>
         <w:rPr>
           <w:rFonts w:hint="eastAsia" w:ascii="宋体" w:hAnsi="宋体" w:cs="宋体"/>
@@ -414,7 +415,7 @@
     </w:p>
     <w:p>
       <w:pPr>
-        <w:spacing w:line="0" w:lineRule="atLeast"/>
+        <w:spacing w:line="0" w:lineRule="atLeast" w:before="160" w:after="80"/>
         <w:rPr>
           <w:rFonts w:ascii="宋体" w:hAnsi="宋体" w:cs="宋体"/>
           <w:b/>
@@ -1330,7 +1331,7 @@
     </w:p>
     <w:p>
       <w:pPr>
-        <w:spacing w:line="0" w:lineRule="atLeast"/>
+        <w:spacing w:line="0" w:lineRule="atLeast" w:before="160" w:after="80"/>
         <w:rPr>
           <w:rFonts w:ascii="宋体" w:hAnsi="宋体" w:cs="宋体"/>
           <w:b/>
@@ -1376,7 +1377,7 @@
         <w:tabs>
           <w:tab w:val="left" w:pos="840"/>
         </w:tabs>
-        <w:spacing w:line="0" w:lineRule="atLeast"/>
+        <w:spacing w:line="280" w:lineRule="auto" w:before="0" w:after="60"/>
         <w:ind w:left="840" w:hanging="360"/>
         <w:jc w:val="both"/>
         <w:rPr>
@@ -1401,7 +1402,7 @@
         <w:tabs>
           <w:tab w:val="left" w:pos="840"/>
         </w:tabs>
-        <w:spacing w:line="0" w:lineRule="atLeast"/>
+        <w:spacing w:line="280" w:lineRule="auto" w:before="0" w:after="60"/>
         <w:ind w:left="840" w:hanging="360"/>
         <w:jc w:val="both"/>
         <w:rPr>
@@ -1439,7 +1440,7 @@
     </w:p>
     <w:p>
       <w:pPr>
-        <w:spacing w:line="0" w:lineRule="atLeast"/>
+        <w:spacing w:line="0" w:lineRule="atLeast" w:before="160" w:after="80"/>
         <w:rPr>
           <w:rFonts w:ascii="宋体" w:hAnsi="宋体" w:cs="宋体"/>
           <w:b/>
@@ -1468,7 +1469,7 @@
     </w:p>
     <w:p>
       <w:pPr>
-        <w:spacing w:line="0" w:lineRule="atLeast"/>
+        <w:spacing w:line="300" w:lineRule="auto" w:before="0" w:after="60"/>
         <w:ind w:left="0" w:leftChars="0" w:right="0" w:rightChars="0" w:firstLineChars="200"/>
         <w:rPr>
           <w:rFonts w:ascii="宋体" w:hAnsi="宋体" w:cs="宋体"/>
@@ -1495,7 +1496,7 @@
     </w:p>
     <w:p>
       <w:pPr>
-        <w:spacing w:line="0" w:lineRule="atLeast"/>
+        <w:spacing w:line="0" w:lineRule="atLeast" w:before="160" w:after="80"/>
         <w:rPr>
           <w:rFonts w:ascii="宋体" w:hAnsi="宋体" w:cs="宋体"/>
           <w:b/>
@@ -1524,7 +1525,7 @@
     </w:p>
     <w:p>
       <w:pPr>
-        <w:spacing w:line="324" w:lineRule="auto"/>
+        <w:spacing w:line="300" w:lineRule="auto" w:before="0" w:after="60"/>
         <w:ind w:left="0" w:leftChars="0" w:right="0" w:rightChars="0" w:firstLineChars="200"/>
         <w:rPr>
           <w:rFonts w:ascii="Times New Roman" w:hAnsi="Times New Roman" w:eastAsia="宋体" w:cs="Times New Roman"/>

</xml_diff>